<commit_message>
Apply final clinical and accessibility review
</commit_message>
<xml_diff>
--- a/docs/downloads/after-delirium.docx
+++ b/docs/downloads/after-delirium.docx
@@ -492,7 +492,7 @@
         <w:rPr>
           <w:rFonts w:ascii="Arial" w:hAnsi="Arial"/>
         </w:rPr>
-        <w:t>Contact the GP or relevant healthcare team about continuing or worsening concerns that are not sudden. Ask who will review cognition, mood, sleep, mobility or daily function if these remain affected.</w:t>
+        <w:t>Contact the GP or relevant healthcare team about continuing or worsening concerns that are not sudden. Ask who will review thinking and memory, mood, sleep, mobility or daily function if these remain affected.</w:t>
       </w:r>
     </w:p>
     <w:p>
@@ -1050,7 +1050,7 @@
     <w:rPr>
       <w:rFonts w:ascii="Arial" w:hAnsi="Arial"/>
       <w:color w:val="102A43"/>
-      <w:sz w:val="22"/>
+      <w:sz w:val="24"/>
     </w:rPr>
   </w:style>
   <w:style w:type="paragraph" w:styleId="Header">
@@ -1586,7 +1586,7 @@
     </w:pPr>
     <w:rPr>
       <w:rFonts w:ascii="Arial" w:hAnsi="Arial"/>
-      <w:sz w:val="22"/>
+      <w:sz w:val="24"/>
     </w:rPr>
   </w:style>
   <w:style w:type="paragraph" w:styleId="ListBullet2">

</xml_diff>

<commit_message>
Publish reviewed Delirium Downloads site
</commit_message>
<xml_diff>
--- a/docs/downloads/after-delirium.docx
+++ b/docs/downloads/after-delirium.docx
@@ -56,7 +56,7 @@
           <w:color w:val="334E68"/>
           <w:sz w:val="23"/>
         </w:rPr>
-        <w:t>To help patients and families know what to ask, what support may be useful and when a new change is urgent.</w:t>
+        <w:t>To help patients and families know what to ask, what may help and when a new change is urgent.</w:t>
       </w:r>
     </w:p>
     <w:tbl>
@@ -322,7 +322,7 @@
         <w:rPr>
           <w:rFonts w:ascii="Arial" w:hAnsi="Arial"/>
         </w:rPr>
-        <w:t>The pattern of recovery varies. Some people have gaps in memory or remember frightening experiences. Concentration, sleep, mood, confidence, appetite, mobility or ability to manage everyday tasks may also be affected. Avoid setting a fixed recovery timetable.</w:t>
+        <w:t>Recovery is different for each person. Some people have gaps in memory or remember frightening experiences. Attention, sleep, mood, confidence, appetite, movement or everyday tasks may also be affected. Do not expect recovery to follow a fixed timetable.</w:t>
       </w:r>
     </w:p>
     <w:p>
@@ -361,7 +361,7 @@
         <w:rPr>
           <w:rFonts w:ascii="Arial" w:hAnsi="Arial"/>
         </w:rPr>
-        <w:t>Confirmation that delirium is included in the clinical record and discharge information</w:t>
+        <w:t>Confirmation that delirium is written in the clinical record and discharge information</w:t>
       </w:r>
     </w:p>
     <w:p>
@@ -383,7 +383,7 @@
         <w:rPr>
           <w:rFonts w:ascii="Arial" w:hAnsi="Arial"/>
         </w:rPr>
-        <w:t>A plan for follow-up, rehabilitation, mobility, nutrition or other support</w:t>
+        <w:t>A plan for follow-up and help with strength, movement, food, drink or everyday tasks</w:t>
       </w:r>
     </w:p>
     <w:p>
@@ -492,7 +492,7 @@
         <w:rPr>
           <w:rFonts w:ascii="Arial" w:hAnsi="Arial"/>
         </w:rPr>
-        <w:t>Contact the GP or relevant healthcare team about continuing or worsening concerns that are not sudden. Ask who will review thinking and memory, mood, sleep, mobility or daily function if these remain affected.</w:t>
+        <w:t>Contact the GP or relevant healthcare team about concerns that continue or get worse but are not sudden. Ask who will review thinking and memory, mood, sleep, movement or daily tasks if these remain affected.</w:t>
       </w:r>
     </w:p>
     <w:p>
@@ -638,7 +638,7 @@
         <w:color w:val="334E68"/>
         <w:sz w:val="15"/>
       </w:rPr>
-      <w:t>deliriumdownloads.com · Template v0.9 · 7 August 2026 · Human clinical review required</w:t>
+      <w:t>deliriumdownloads.com · Template v0.9 · 8 August 2026 · Human clinical review required</w:t>
     </w:r>
     <w:r>
       <w:tab/>

</xml_diff>

<commit_message>
Publish reviewed Delirium Downloads site (#1)
Co-authored-by: amaclullich-ai <a.maclullich@googlemail.com>
</commit_message>
<xml_diff>
--- a/docs/downloads/after-delirium.docx
+++ b/docs/downloads/after-delirium.docx
@@ -56,7 +56,7 @@
           <w:color w:val="334E68"/>
           <w:sz w:val="23"/>
         </w:rPr>
-        <w:t>To help patients and families know what to ask, what support may be useful and when a new change is urgent.</w:t>
+        <w:t>To help patients and families know what to ask, what may help and when a new change is urgent.</w:t>
       </w:r>
     </w:p>
     <w:tbl>
@@ -322,7 +322,7 @@
         <w:rPr>
           <w:rFonts w:ascii="Arial" w:hAnsi="Arial"/>
         </w:rPr>
-        <w:t>The pattern of recovery varies. Some people have gaps in memory or remember frightening experiences. Concentration, sleep, mood, confidence, appetite, mobility or ability to manage everyday tasks may also be affected. Avoid setting a fixed recovery timetable.</w:t>
+        <w:t>Recovery is different for each person. Some people have gaps in memory or remember frightening experiences. Attention, sleep, mood, confidence, appetite, movement or everyday tasks may also be affected. Do not expect recovery to follow a fixed timetable.</w:t>
       </w:r>
     </w:p>
     <w:p>
@@ -361,7 +361,7 @@
         <w:rPr>
           <w:rFonts w:ascii="Arial" w:hAnsi="Arial"/>
         </w:rPr>
-        <w:t>Confirmation that delirium is included in the clinical record and discharge information</w:t>
+        <w:t>Confirmation that delirium is written in the clinical record and discharge information</w:t>
       </w:r>
     </w:p>
     <w:p>
@@ -383,7 +383,7 @@
         <w:rPr>
           <w:rFonts w:ascii="Arial" w:hAnsi="Arial"/>
         </w:rPr>
-        <w:t>A plan for follow-up, rehabilitation, mobility, nutrition or other support</w:t>
+        <w:t>A plan for follow-up and help with strength, movement, food, drink or everyday tasks</w:t>
       </w:r>
     </w:p>
     <w:p>
@@ -492,7 +492,7 @@
         <w:rPr>
           <w:rFonts w:ascii="Arial" w:hAnsi="Arial"/>
         </w:rPr>
-        <w:t>Contact the GP or relevant healthcare team about continuing or worsening concerns that are not sudden. Ask who will review thinking and memory, mood, sleep, mobility or daily function if these remain affected.</w:t>
+        <w:t>Contact the GP or relevant healthcare team about concerns that continue or get worse but are not sudden. Ask who will review thinking and memory, mood, sleep, movement or daily tasks if these remain affected.</w:t>
       </w:r>
     </w:p>
     <w:p>
@@ -638,7 +638,7 @@
         <w:color w:val="334E68"/>
         <w:sz w:val="15"/>
       </w:rPr>
-      <w:t>deliriumdownloads.com · Template v0.9 · 7 August 2026 · Human clinical review required</w:t>
+      <w:t>deliriumdownloads.com · Template v0.9 · 8 August 2026 · Human clinical review required</w:t>
     </w:r>
     <w:r>
       <w:tab/>

</xml_diff>